<commit_message>
Added results for more cross-dataset analysis and updated docs
</commit_message>
<xml_diff>
--- a/docs/mircea_meche_disertatie_mai.docx
+++ b/docs/mircea_meche_disertatie_mai.docx
@@ -5530,7 +5530,25 @@
           <w:sz w:val="32"/>
           <w:szCs w:val="32"/>
         </w:rPr>
-        <w:t xml:space="preserve">Motivatia lucrarii </w:t>
+        <w:t>Motivația</w:t>
+      </w:r>
+      <w:r>
+        <w:rPr>
+          <w:b/>
+          <w:bCs/>
+          <w:sz w:val="32"/>
+          <w:szCs w:val="32"/>
+        </w:rPr>
+        <w:t xml:space="preserve"> </w:t>
+      </w:r>
+      <w:r>
+        <w:rPr>
+          <w:b/>
+          <w:bCs/>
+          <w:sz w:val="32"/>
+          <w:szCs w:val="32"/>
+        </w:rPr>
+        <w:t>lucrării</w:t>
       </w:r>
     </w:p>
     <w:p>
@@ -5545,82 +5563,6 @@
         <w:rPr>
           <w:szCs w:val="24"/>
         </w:rPr>
-      </w:pPr>
-    </w:p>
-    <w:p>
-      <w:pPr>
-        <w:widowControl w:val="0"/>
-        <w:tabs>
-          <w:tab w:val="left" w:pos="567"/>
-        </w:tabs>
-        <w:autoSpaceDE w:val="0"/>
-        <w:autoSpaceDN w:val="0"/>
-        <w:adjustRightInd w:val="0"/>
-        <w:rPr>
-          <w:szCs w:val="24"/>
-        </w:rPr>
-      </w:pPr>
-      <w:r>
-        <w:rPr>
-          <w:szCs w:val="24"/>
-        </w:rPr>
-        <w:t>amogus</w:t>
-      </w:r>
-    </w:p>
-    <w:p>
-      <w:pPr>
-        <w:widowControl w:val="0"/>
-        <w:tabs>
-          <w:tab w:val="left" w:pos="567"/>
-        </w:tabs>
-        <w:autoSpaceDE w:val="0"/>
-        <w:autoSpaceDN w:val="0"/>
-        <w:adjustRightInd w:val="0"/>
-        <w:rPr>
-          <w:szCs w:val="24"/>
-        </w:rPr>
-      </w:pPr>
-    </w:p>
-    <w:p>
-      <w:pPr>
-        <w:pStyle w:val="ListParagraph"/>
-        <w:widowControl w:val="0"/>
-        <w:numPr>
-          <w:ilvl w:val="1"/>
-          <w:numId w:val="32"/>
-        </w:numPr>
-        <w:tabs>
-          <w:tab w:val="left" w:pos="567"/>
-        </w:tabs>
-        <w:autoSpaceDE w:val="0"/>
-        <w:autoSpaceDN w:val="0"/>
-        <w:adjustRightInd w:val="0"/>
-        <w:rPr>
-          <w:b/>
-          <w:bCs/>
-          <w:sz w:val="32"/>
-          <w:szCs w:val="32"/>
-        </w:rPr>
-      </w:pPr>
-      <w:r>
-        <w:rPr>
-          <w:b/>
-          <w:bCs/>
-          <w:sz w:val="32"/>
-          <w:szCs w:val="32"/>
-        </w:rPr>
-        <w:t>Descrierea generală a GNSS-ului</w:t>
-      </w:r>
-    </w:p>
-    <w:p>
-      <w:pPr>
-        <w:widowControl w:val="0"/>
-        <w:tabs>
-          <w:tab w:val="left" w:pos="567"/>
-        </w:tabs>
-        <w:autoSpaceDE w:val="0"/>
-        <w:autoSpaceDN w:val="0"/>
-        <w:adjustRightInd w:val="0"/>
       </w:pPr>
     </w:p>
     <w:p>
@@ -5633,21 +5575,99 @@
         <w:autoSpaceDN w:val="0"/>
         <w:adjustRightInd w:val="0"/>
         <w:jc w:val="both"/>
-      </w:pPr>
+        <w:rPr>
+          <w:szCs w:val="24"/>
+        </w:rPr>
+      </w:pPr>
+      <w:r>
+        <w:tab/>
+      </w:r>
       <w:r>
         <w:t xml:space="preserve">Sistemul de Navigație Globală prin Satelit </w:t>
       </w:r>
       <w:r>
-        <w:t xml:space="preserve">(GNSS) a devenit un sistem vital pentru omenire, asigurand servicii de navigatie de acuratete mare atat pentru utilizatori individuali, cat si pentru utilizatori comerciali, companii de transport de bunuri, utilizatori militari si multi altii. GNSS reprezinta un termen general care inglobeaza mai multe </w:t>
-      </w:r>
-      <w:r>
-        <w:t>constelatii de sateliti</w:t>
-      </w:r>
-      <w:r>
-        <w:t xml:space="preserve"> de naviagatie: sistemul GPS, dezvoltat de Statele Unite ale Americii in anii ’70, GLONASS, dezvoltat de Uniunea Sovietica in anii ’80, BEIDOU, dezvoltat de China in anii 2000, si GALILEO, dezvoltat de membrii Uniunii Europene in anii 2000. GNSS-ul reprezinta </w:t>
-      </w:r>
-      <w:r>
-        <w:t xml:space="preserve">un exemplu de navigatie pe baza masurarii diferentei de timp la momentul receptiei (TDOA). </w:t>
+        <w:t xml:space="preserve">(GNSS) a devenit </w:t>
+      </w:r>
+      <w:r>
+        <w:t xml:space="preserve">o tehnologie vitală </w:t>
+      </w:r>
+      <w:r>
+        <w:t xml:space="preserve">pentru omenire, </w:t>
+      </w:r>
+      <w:r>
+        <w:t>asigurând</w:t>
+      </w:r>
+      <w:r>
+        <w:t xml:space="preserve"> servicii de </w:t>
+      </w:r>
+      <w:r>
+        <w:t>navigație</w:t>
+      </w:r>
+      <w:r>
+        <w:t xml:space="preserve"> de </w:t>
+      </w:r>
+      <w:r>
+        <w:t>acuratețe</w:t>
+      </w:r>
+      <w:r>
+        <w:t xml:space="preserve"> mare </w:t>
+      </w:r>
+      <w:r>
+        <w:t>atât</w:t>
+      </w:r>
+      <w:r>
+        <w:t xml:space="preserve"> pentru utilizatori individuali, cat si pentru utilizatori comerciali, companii de transport de bunuri</w:t>
+      </w:r>
+      <w:r>
+        <w:t xml:space="preserve"> sau </w:t>
+      </w:r>
+      <w:r>
+        <w:t>organizații</w:t>
+      </w:r>
+      <w:r>
+        <w:t xml:space="preserve"> militare.</w:t>
+      </w:r>
+      <w:r>
+        <w:rPr>
+          <w:szCs w:val="24"/>
+        </w:rPr>
+        <w:t xml:space="preserve"> </w:t>
+      </w:r>
+      <w:r>
+        <w:t xml:space="preserve">GNSS </w:t>
+      </w:r>
+      <w:r>
+        <w:t>reprezintă</w:t>
+      </w:r>
+      <w:r>
+        <w:t xml:space="preserve"> un termen general care </w:t>
+      </w:r>
+      <w:r>
+        <w:t>înglobează</w:t>
+      </w:r>
+      <w:r>
+        <w:t xml:space="preserve"> mai multe </w:t>
+      </w:r>
+      <w:r>
+        <w:t>constelații</w:t>
+      </w:r>
+      <w:r>
+        <w:t xml:space="preserve"> de </w:t>
+      </w:r>
+      <w:r>
+        <w:t>sateliți</w:t>
+      </w:r>
+      <w:r>
+        <w:t xml:space="preserve"> de </w:t>
+      </w:r>
+      <w:r>
+        <w:t>navigație</w:t>
+      </w:r>
+      <w:r>
+        <w:t>: sistemul GPS, dezvoltat de Statele Unite ale Americii in anii ’70, GLONASS, dezvoltat de Uniunea Sovietica in anii ’80, BEIDOU, dezvoltat de China in anii 2000, si GALILEO, dezvoltat de membrii Uniunii Europene in anii 2000</w:t>
+      </w:r>
+      <w:r>
+        <w:t xml:space="preserve"> [1].</w:t>
       </w:r>
     </w:p>
     <w:p>
@@ -5678,9 +5698,9 @@
           <w:noProof/>
         </w:rPr>
         <w:drawing>
-          <wp:inline distT="0" distB="0" distL="0" distR="0" wp14:anchorId="590869F9" wp14:editId="6819B908">
-            <wp:extent cx="3522263" cy="2467841"/>
-            <wp:effectExtent l="19050" t="19050" r="21590" b="27940"/>
+          <wp:inline distT="0" distB="0" distL="0" distR="0" wp14:anchorId="590869F9" wp14:editId="1D50C550">
+            <wp:extent cx="3912870" cy="2741517"/>
+            <wp:effectExtent l="19050" t="19050" r="11430" b="20955"/>
             <wp:docPr id="930059714" name="Picture 1"/>
             <wp:cNvGraphicFramePr>
               <a:graphicFrameLocks xmlns:a="http://schemas.openxmlformats.org/drawingml/2006/main" noChangeAspect="1"/>
@@ -5710,7 +5730,7 @@
                   <pic:spPr bwMode="auto">
                     <a:xfrm>
                       <a:off x="0" y="0"/>
-                      <a:ext cx="3554028" cy="2490097"/>
+                      <a:ext cx="3961398" cy="2775518"/>
                     </a:xfrm>
                     <a:prstGeom prst="rect">
                       <a:avLst/>
@@ -5741,7 +5761,13 @@
         <w:jc w:val="center"/>
       </w:pPr>
       <w:r>
-        <w:t>Figura 1.1: Conceptul pozitionarii pe baza GNSS</w:t>
+        <w:t xml:space="preserve">Figura 1.1: Conceptul </w:t>
+      </w:r>
+      <w:r>
+        <w:t>poziționării</w:t>
+      </w:r>
+      <w:r>
+        <w:t xml:space="preserve"> pe baza GNSS</w:t>
       </w:r>
       <w:r>
         <w:t xml:space="preserve"> [2]</w:t>
@@ -5756,83 +5782,431 @@
         <w:autoSpaceDE w:val="0"/>
         <w:autoSpaceDN w:val="0"/>
         <w:adjustRightInd w:val="0"/>
-        <w:rPr>
-          <w:b/>
-          <w:bCs/>
-          <w:szCs w:val="24"/>
-        </w:rPr>
-      </w:pPr>
-    </w:p>
-    <w:p>
-      <w:pPr>
+        <w:jc w:val="center"/>
+      </w:pPr>
+    </w:p>
+    <w:p>
+      <w:pPr>
+        <w:widowControl w:val="0"/>
+        <w:tabs>
+          <w:tab w:val="left" w:pos="567"/>
+        </w:tabs>
+        <w:autoSpaceDE w:val="0"/>
+        <w:autoSpaceDN w:val="0"/>
+        <w:adjustRightInd w:val="0"/>
         <w:jc w:val="both"/>
       </w:pPr>
       <w:r>
-        <w:rPr>
-          <w:szCs w:val="24"/>
-        </w:rPr>
-        <w:t>Conform [1] si [2], pozitia receptorului terestru este dete</w:t>
-      </w:r>
-      <w:r>
-        <w:rPr>
-          <w:szCs w:val="24"/>
-        </w:rPr>
-        <w:t>rminata prin transmiterea unui mesaj de navigatie de la satelit catre receptor, acel mesaj contine, printre multe alte elemente, momentul transmisiei si pozitia satelitului la momentul transmiterii mesajului. Astfel, receptorul poate masura momentul la care mesajul a fost receptionat, si poate determina diferenta de timp, din care se poate determina usor distanta dintre receptor si satelit prin folosirea formulei pentru distanta (</w:t>
-      </w:r>
-      <m:oMath>
-        <m:r>
-          <m:rPr>
-            <m:nor/>
-          </m:rPr>
-          <w:rPr>
-            <w:rFonts w:ascii="Cambria Math" w:hAnsi="Cambria Math"/>
-            <w:i/>
-            <w:iCs/>
-          </w:rPr>
-          <m:t>r</m:t>
-        </m:r>
-        <m:r>
-          <w:rPr>
-            <w:rFonts w:ascii="Cambria Math" w:hAnsi="Cambria Math"/>
-          </w:rPr>
-          <m:t>=</m:t>
-        </m:r>
-        <m:r>
-          <m:rPr>
-            <m:nor/>
-          </m:rPr>
-          <w:rPr>
-            <w:rFonts w:ascii="Cambria Math" w:hAnsi="Cambria Math"/>
-            <w:i/>
-            <w:iCs/>
-          </w:rPr>
-          <m:t>c</m:t>
-        </m:r>
-        <m:r>
-          <w:rPr>
-            <w:rFonts w:ascii="Cambria Math" w:hAnsi="Cambria Math"/>
-          </w:rPr>
-          <m:t>*t</m:t>
-        </m:r>
-      </m:oMath>
-      <w:r>
-        <w:t>). Totusi, in realitate, nu este suficienta folosirea unui singur satelit, deoarece intervin mai multe nivele de ambiguitate.</w:t>
-      </w:r>
-    </w:p>
-    <w:p>
-      <w:pPr>
+        <w:tab/>
+      </w:r>
+      <w:r>
+        <w:t xml:space="preserve">Prin dezvoltarea tehnologiilor utilizate si includea noilor </w:t>
+      </w:r>
+      <w:r>
+        <w:t>constelații</w:t>
+      </w:r>
+      <w:r>
+        <w:t xml:space="preserve"> de </w:t>
+      </w:r>
+      <w:r>
+        <w:t>sateliții</w:t>
+      </w:r>
+      <w:r>
+        <w:t xml:space="preserve">, sistemul GNSS a ajuns sa ofere servicii de </w:t>
+      </w:r>
+      <w:r>
+        <w:t>înaltă</w:t>
+      </w:r>
+      <w:r>
+        <w:t xml:space="preserve"> precizie. Cu toate acestea, fiind vorba de semnale radio, acestea pot fi afectate de interferente, </w:t>
+      </w:r>
+      <w:r>
+        <w:t>atât</w:t>
+      </w:r>
+      <w:r>
+        <w:t xml:space="preserve"> </w:t>
+      </w:r>
+      <w:r>
+        <w:t>neintenționate</w:t>
+      </w:r>
+      <w:r>
+        <w:t xml:space="preserve">, cum sunt </w:t>
+      </w:r>
+      <w:r>
+        <w:t xml:space="preserve">efectele ionosferei, </w:t>
+      </w:r>
+      <w:r>
+        <w:t>deviația</w:t>
+      </w:r>
+      <w:r>
+        <w:t xml:space="preserve"> ceasului receptorului</w:t>
+      </w:r>
+      <w:r>
+        <w:t xml:space="preserve">, </w:t>
+      </w:r>
+      <w:r>
+        <w:t xml:space="preserve">fenomenul de reflexie al undelor (lb en.; </w:t>
+      </w:r>
+      <w:r>
+        <w:rPr>
+          <w:i/>
+          <w:iCs/>
+        </w:rPr>
+        <w:t>multipath</w:t>
+      </w:r>
+      <w:r>
+        <w:t xml:space="preserve">) sau de pierdere a traiectoriei directe de propagare (lb. en.; </w:t>
+      </w:r>
+      <w:r>
+        <w:rPr>
+          <w:i/>
+          <w:iCs/>
+        </w:rPr>
+        <w:t>line of sight loss</w:t>
+      </w:r>
+      <w:r>
+        <w:t>)</w:t>
+      </w:r>
+      <w:r>
+        <w:t xml:space="preserve">, cat si </w:t>
+      </w:r>
+      <w:r>
+        <w:t>intenționate</w:t>
+      </w:r>
+      <w:r>
+        <w:t xml:space="preserve">, care au ca scop </w:t>
+      </w:r>
+      <w:r>
+        <w:t>împiedicarea</w:t>
+      </w:r>
+      <w:r>
+        <w:t xml:space="preserve"> </w:t>
+      </w:r>
+      <w:r>
+        <w:t>obținerii</w:t>
+      </w:r>
+      <w:r>
+        <w:t xml:space="preserve"> unei </w:t>
+      </w:r>
+      <w:r>
+        <w:t>estimări</w:t>
+      </w:r>
+      <w:r>
+        <w:t xml:space="preserve"> corecte de </w:t>
+      </w:r>
+      <w:r>
+        <w:t>poziție</w:t>
+      </w:r>
+      <w:r>
+        <w:t xml:space="preserve">, fiind transmise in spectrul de frecvente de </w:t>
+      </w:r>
+      <w:r>
+        <w:t>către</w:t>
+      </w:r>
+      <w:r>
+        <w:t xml:space="preserve"> o terță parte si fiind </w:t>
+      </w:r>
+      <w:r>
+        <w:t>încadrate</w:t>
+      </w:r>
+      <w:r>
+        <w:t xml:space="preserve"> in doua mari categorii: semnalele de bruiaj (lb. en.; </w:t>
+      </w:r>
+      <w:r>
+        <w:rPr>
+          <w:i/>
+          <w:iCs/>
+        </w:rPr>
+        <w:t>jamming</w:t>
+      </w:r>
+      <w:r>
+        <w:t xml:space="preserve">) si semnalele de falsificare (lb. en.; </w:t>
+      </w:r>
+      <w:r>
+        <w:rPr>
+          <w:i/>
+          <w:iCs/>
+        </w:rPr>
+        <w:t>spoofing</w:t>
+      </w:r>
+      <w:r>
+        <w:t xml:space="preserve">). </w:t>
+      </w:r>
+      <w:r>
+        <w:t xml:space="preserve">Din </w:t>
+      </w:r>
+      <w:r>
+        <w:t>păcate</w:t>
+      </w:r>
+      <w:r>
+        <w:t xml:space="preserve">, conflictul </w:t>
+      </w:r>
+      <w:r>
+        <w:t>încă</w:t>
+      </w:r>
+      <w:r>
+        <w:t xml:space="preserve"> deschis de la </w:t>
+      </w:r>
+      <w:r>
+        <w:t>granița</w:t>
+      </w:r>
+      <w:r>
+        <w:t xml:space="preserve"> </w:t>
+      </w:r>
+      <w:r>
+        <w:t>României</w:t>
+      </w:r>
+      <w:r>
+        <w:t xml:space="preserve"> dintre Ucraina si Rusia [</w:t>
+      </w:r>
+      <w:r>
+        <w:t>war</w:t>
+      </w:r>
+      <w:r>
+        <w:t xml:space="preserve">], precum si multe alte conflicte a </w:t>
+      </w:r>
+      <w:r>
+        <w:t>însemnat</w:t>
+      </w:r>
+      <w:r>
+        <w:t xml:space="preserve"> un puternic val de </w:t>
+      </w:r>
+      <w:r>
+        <w:t>interferențe GNSS</w:t>
+      </w:r>
+      <w:r>
+        <w:t xml:space="preserve">, </w:t>
+      </w:r>
+      <w:r>
+        <w:t>împiedicând</w:t>
+      </w:r>
+      <w:r>
+        <w:t xml:space="preserve"> astfel buna </w:t>
+      </w:r>
+      <w:r>
+        <w:t>funcționare</w:t>
+      </w:r>
+      <w:r>
+        <w:t xml:space="preserve"> a rutelor comerciale. Progresul tehnologic in domeniul dispozitivelor radio, cum sunt dispozitivele SDR, a </w:t>
+      </w:r>
+      <w:r>
+        <w:t>scăzut</w:t>
+      </w:r>
+      <w:r>
+        <w:t xml:space="preserve"> </w:t>
+      </w:r>
+      <w:r>
+        <w:lastRenderedPageBreak/>
+        <w:t xml:space="preserve">nivelul de </w:t>
+      </w:r>
+      <w:r>
+        <w:t>cunoștințe</w:t>
+      </w:r>
+      <w:r>
+        <w:t xml:space="preserve"> tehnice necesare pentru a putea realiza sisteme capabile sa interfereze cu semnalele GNSS, dar si sisteme capabile sa </w:t>
+      </w:r>
+      <w:r>
+        <w:t>recepționeze</w:t>
+      </w:r>
+      <w:r>
+        <w:t xml:space="preserve"> astfel de semnale nocive cu scopul de a le cerceta. </w:t>
+      </w:r>
+    </w:p>
+    <w:p>
+      <w:pPr>
+        <w:widowControl w:val="0"/>
+        <w:tabs>
+          <w:tab w:val="left" w:pos="567"/>
+        </w:tabs>
+        <w:autoSpaceDE w:val="0"/>
+        <w:autoSpaceDN w:val="0"/>
+        <w:adjustRightInd w:val="0"/>
+        <w:jc w:val="both"/>
+      </w:pPr>
+      <w:r>
+        <w:tab/>
+      </w:r>
+      <w:r>
+        <w:t xml:space="preserve">In ultimii ani, </w:t>
+      </w:r>
+      <w:r>
+        <w:t xml:space="preserve">domeniul sistemelor cu </w:t>
+      </w:r>
+      <w:r>
+        <w:t>învățare</w:t>
+      </w:r>
+      <w:r>
+        <w:t xml:space="preserve"> automata (lb. eng.; </w:t>
+      </w:r>
+      <w:r>
+        <w:rPr>
+          <w:i/>
+          <w:iCs/>
+        </w:rPr>
+        <w:t>machine learning</w:t>
+      </w:r>
+      <w:r>
+        <w:t xml:space="preserve">) </w:t>
+      </w:r>
+      <w:r>
+        <w:t xml:space="preserve">a crescut foarte mult, </w:t>
+      </w:r>
+      <w:r>
+        <w:t xml:space="preserve">prin implementarea unor sisteme capabile </w:t>
+      </w:r>
+      <w:r>
+        <w:t xml:space="preserve">sa ia decizii sau sa </w:t>
+      </w:r>
+      <w:r>
+        <w:t>facă</w:t>
+      </w:r>
+      <w:r>
+        <w:t xml:space="preserve"> </w:t>
+      </w:r>
+      <w:r>
+        <w:t>predicții</w:t>
+      </w:r>
+      <w:r>
+        <w:t xml:space="preserve"> pe baza unor seturi de date [intro-ml-mit]</w:t>
+      </w:r>
+      <w:r>
+        <w:t>.</w:t>
+      </w:r>
+      <w:r>
+        <w:t xml:space="preserve"> </w:t>
+      </w:r>
+      <w:r>
+        <w:t>Dezvoltarea unor</w:t>
+      </w:r>
+      <w:r>
+        <w:t xml:space="preserve"> </w:t>
+      </w:r>
+      <w:r>
+        <w:t>ansambluri</w:t>
+      </w:r>
+      <w:r>
+        <w:t xml:space="preserve"> </w:t>
+      </w:r>
+      <w:r>
+        <w:t>computaționale</w:t>
+      </w:r>
+      <w:r>
+        <w:t xml:space="preserve"> mai avansate</w:t>
+      </w:r>
+      <w:r>
+        <w:t>, cum ar fi adaptoarele grafice pentru calculatoare personale</w:t>
+      </w:r>
+      <w:r>
+        <w:t xml:space="preserve">, </w:t>
+      </w:r>
+      <w:r>
+        <w:t>au deschis</w:t>
+      </w:r>
+      <w:r>
+        <w:t xml:space="preserve"> subiectul </w:t>
+      </w:r>
+      <w:r>
+        <w:t>implementării relativ rapide si ușoare a</w:t>
+      </w:r>
+      <w:r>
+        <w:t xml:space="preserve"> sistemelor cu </w:t>
+      </w:r>
+      <w:r>
+        <w:t>învățare</w:t>
+      </w:r>
+      <w:r>
+        <w:t xml:space="preserve"> automata in diverse domenii, inclusiv in cel al semnalelor GNSS, clasificarea </w:t>
+      </w:r>
+      <w:r>
+        <w:t>interferențelor</w:t>
+      </w:r>
+      <w:r>
+        <w:t xml:space="preserve"> fiind o astfel de utilizare a lor in domeniu. </w:t>
+      </w:r>
+    </w:p>
+    <w:p>
+      <w:pPr>
+        <w:widowControl w:val="0"/>
+        <w:tabs>
+          <w:tab w:val="left" w:pos="567"/>
+        </w:tabs>
+        <w:autoSpaceDE w:val="0"/>
+        <w:autoSpaceDN w:val="0"/>
+        <w:adjustRightInd w:val="0"/>
+        <w:jc w:val="both"/>
+      </w:pPr>
+      <w:r>
+        <w:tab/>
+      </w:r>
+      <w:r>
+        <w:t xml:space="preserve">Mai mult, interesul puternic in sisteme automate a dus industria in </w:t>
+      </w:r>
+      <w:r>
+        <w:t>direcția</w:t>
+      </w:r>
+      <w:r>
+        <w:t xml:space="preserve"> includerii unor </w:t>
+      </w:r>
+      <w:r>
+        <w:t>sisteme</w:t>
+      </w:r>
+      <w:r>
+        <w:t xml:space="preserve"> </w:t>
+      </w:r>
+      <w:r>
+        <w:t>computaționale</w:t>
+      </w:r>
+      <w:r>
+        <w:t xml:space="preserve"> dedicate pentru sisteme cu </w:t>
+      </w:r>
+      <w:r>
+        <w:t>învățare</w:t>
+      </w:r>
+      <w:r>
+        <w:t xml:space="preserve"> automata, </w:t>
+      </w:r>
+      <w:r>
+        <w:t>garantând</w:t>
+      </w:r>
+      <w:r>
+        <w:t xml:space="preserve"> astfel utilizarea lor in mod constant. </w:t>
+      </w:r>
+      <w:r>
+        <w:t xml:space="preserve">Astfel, multe dispozitive moderne sunt echipate cu „unități de procesare neurală”, care ocupă un spațiu dedicat în procesoarele de calcul ale noii generații de dispozitive personale (calculatoare, laptop-uri, telefoane mobile ș.a.m.d.). </w:t>
+      </w:r>
+    </w:p>
+    <w:p>
+      <w:pPr>
+        <w:widowControl w:val="0"/>
+        <w:tabs>
+          <w:tab w:val="left" w:pos="567"/>
+        </w:tabs>
+        <w:autoSpaceDE w:val="0"/>
+        <w:autoSpaceDN w:val="0"/>
+        <w:adjustRightInd w:val="0"/>
+        <w:jc w:val="both"/>
+      </w:pPr>
+    </w:p>
+    <w:p>
+      <w:pPr>
+        <w:widowControl w:val="0"/>
+        <w:tabs>
+          <w:tab w:val="left" w:pos="567"/>
+        </w:tabs>
+        <w:autoSpaceDE w:val="0"/>
+        <w:autoSpaceDN w:val="0"/>
+        <w:adjustRightInd w:val="0"/>
         <w:jc w:val="center"/>
       </w:pPr>
       <w:r>
         <w:rPr>
           <w:noProof/>
         </w:rPr>
-        <w:lastRenderedPageBreak/>
         <w:drawing>
-          <wp:inline distT="0" distB="0" distL="0" distR="0" wp14:anchorId="23737B45" wp14:editId="40D0334B">
-            <wp:extent cx="4681277" cy="3098223"/>
-            <wp:effectExtent l="19050" t="19050" r="24130" b="26035"/>
-            <wp:docPr id="1207911517" name="Picture 2"/>
+          <wp:inline distT="0" distB="0" distL="0" distR="0" wp14:anchorId="5C41E224" wp14:editId="3617CF94">
+            <wp:extent cx="3869601" cy="2636520"/>
+            <wp:effectExtent l="19050" t="19050" r="17145" b="11430"/>
+            <wp:docPr id="265973152" name="Picture 3"/>
             <wp:cNvGraphicFramePr>
               <a:graphicFrameLocks xmlns:a="http://schemas.openxmlformats.org/drawingml/2006/main" noChangeAspect="1"/>
             </wp:cNvGraphicFramePr>
@@ -5840,10 +6214,8 @@
               <a:graphicData uri="http://schemas.openxmlformats.org/drawingml/2006/picture">
                 <pic:pic xmlns:pic="http://schemas.openxmlformats.org/drawingml/2006/picture">
                   <pic:nvPicPr>
-                    <pic:cNvPr id="0" name="Picture 3"/>
-                    <pic:cNvPicPr>
-                      <a:picLocks noChangeAspect="1" noChangeArrowheads="1"/>
-                    </pic:cNvPicPr>
+                    <pic:cNvPr id="265973152" name="Picture 265973152"/>
+                    <pic:cNvPicPr/>
                   </pic:nvPicPr>
                   <pic:blipFill>
                     <a:blip r:embed="rId47">
@@ -5853,20 +6225,18 @@
                         </a:ext>
                       </a:extLst>
                     </a:blip>
-                    <a:srcRect/>
                     <a:stretch>
                       <a:fillRect/>
                     </a:stretch>
                   </pic:blipFill>
-                  <pic:spPr bwMode="auto">
+                  <pic:spPr>
                     <a:xfrm>
                       <a:off x="0" y="0"/>
-                      <a:ext cx="4700395" cy="3110876"/>
+                      <a:ext cx="3878242" cy="2642408"/>
                     </a:xfrm>
                     <a:prstGeom prst="rect">
                       <a:avLst/>
                     </a:prstGeom>
-                    <a:noFill/>
                     <a:ln>
                       <a:solidFill>
                         <a:schemeClr val="tx1"/>
@@ -5892,68 +6262,7 @@
         <w:jc w:val="center"/>
       </w:pPr>
       <w:r>
-        <w:t>Figura 1.2 Perspectiva geometrica asupra poziționării bidimensionale [3]</w:t>
-      </w:r>
-    </w:p>
-    <w:p>
-      <w:pPr>
-        <w:jc w:val="center"/>
-      </w:pPr>
-    </w:p>
-    <w:p>
-      <w:pPr>
-        <w:ind w:firstLine="720"/>
-        <w:jc w:val="both"/>
-      </w:pPr>
-      <w:r>
-        <w:t xml:space="preserve">In primul rand, </w:t>
-      </w:r>
-      <w:r>
-        <w:t xml:space="preserve">prin folosirea unui singur satelit, exista un nivel de ambiguitate, pentru ca pozitia exacta a receptorului se afla pe un suprafata unei sfere de raza </w:t>
-      </w:r>
-      <w:r>
-        <w:rPr>
-          <w:i/>
-          <w:iCs/>
-        </w:rPr>
-        <w:t>r</w:t>
-      </w:r>
-      <w:r>
-        <w:t xml:space="preserve"> care reprezinta distanta geometrica dintre satelit si receptor. Prin folosirea celui de-al doilea satelit, pozitia poate fi determinata ca fiind la intersectia celor 2 sfere, ceea ce ofera posibilitatea a cel putin doua solutii posibile, ambiguitate care poate fi rezolvata prin folosirea celui de-al treilea satelit. In mod evident, pot fi inlaturate din calcul pozitiile care nu se alfa pe suprafata terestra, lucru care simplifica calculele. </w:t>
-      </w:r>
-    </w:p>
-    <w:p>
-      <w:pPr>
-        <w:ind w:firstLine="720"/>
-        <w:jc w:val="both"/>
-      </w:pPr>
-      <w:r>
-        <w:t>In al doilea rand, deoarece determinarea pozitiei se face pe baza masurarii timpului, intervine un nivel de ambiguitate generat de calitatea ceasurilor folosite. Satelitii GNSS sunt echipati cu ceasuri atomice, care ofera cea mai mare precizie posibila, in timp ce receptoarele teresetre sunt preponderent echipate cu ceasuri pe baza de oscilatoare de cristal, care deviaza cu cateva secunde odata la cateva saptamani sau luni, ceea ce poate crea probleme foarte mari in determinarea pozitiei, datorita faptului ca satelitii GNSS se afla in orbita medie a Pamantului (circa 20000-24000 de km altitudine), iar o eroare de cateva secunde in timp duce la o estimare a pozitiei cu o eroare de cateva sute de metri. De aceea, in teorie, se foloseste un al patrulea satelit pentru a putea verifica acuratetea diferentei de timp pentru ceilalti trei sateliti, si astfel se obtine un sistem determinist cu 4 ecuatii si 4 necunoscute (</w:t>
-      </w:r>
-      <w:r>
-        <w:t xml:space="preserve">pozitia tridimensionala si timpul). </w:t>
-      </w:r>
-    </w:p>
-    <w:p>
-      <w:pPr>
-        <w:ind w:firstLine="360"/>
-        <w:jc w:val="both"/>
-      </w:pPr>
-      <w:r>
-        <w:t>In practica, sistemul este supradeterminat, fiind utilizati mai mult de 4 sateliti la orice moment de timp, garantand astfel acuratete mult mai mare pentru utilizatori.</w:t>
-      </w:r>
-      <w:r>
-        <w:t xml:space="preserve"> Ambiguitatea de timp este motivul pentru care distanta pe care receptorul o calculeaza nu este distanta geometrica, reala, dintre sine si satelit, si pseudo-distanta (lb. en.; </w:t>
-      </w:r>
-      <w:r>
-        <w:rPr>
-          <w:i/>
-          <w:iCs/>
-        </w:rPr>
-        <w:t>pseudorange</w:t>
-      </w:r>
-      <w:r>
-        <w:t>), care este calculata ca fiind distanta geometrica plus alti termeni, derivati din caracteristicile de zgomot ale echipamentului, ale semnalului, precum si alte efectul altor fenomene.</w:t>
+        <w:t>Figura 1.2: Structura unei rețele neurale []</w:t>
       </w:r>
     </w:p>
     <w:p>
@@ -5965,7 +6274,132 @@
         <w:autoSpaceDE w:val="0"/>
         <w:autoSpaceDN w:val="0"/>
         <w:adjustRightInd w:val="0"/>
-        <w:rPr>
+        <w:jc w:val="both"/>
+      </w:pPr>
+    </w:p>
+    <w:p>
+      <w:pPr>
+        <w:widowControl w:val="0"/>
+        <w:tabs>
+          <w:tab w:val="left" w:pos="567"/>
+        </w:tabs>
+        <w:autoSpaceDE w:val="0"/>
+        <w:autoSpaceDN w:val="0"/>
+        <w:adjustRightInd w:val="0"/>
+        <w:jc w:val="both"/>
+      </w:pPr>
+      <w:r>
+        <w:tab/>
+      </w:r>
+      <w:r>
+        <w:t xml:space="preserve">Toate aceste dezvoltări au deschis mai departe poarte unor noi posibilități de dezvoltare. Într-o lume marcată de schimbări, în care tehnologiile existente sunt amenințate constant, orice dispozitiv capabil să utilizeze semnale GNSS și care beneficază de procesoare dedicate funcțiilor asistate de inteligența artificială pot devenii indicatori ale performanțelor sistemului de navigație, permițând astfel efectuarea tehnicilor de mitigare ale interferențelor, sau chiar mai mult, de localizare ale acestora, cum se demonstrează în </w:t>
+      </w:r>
+      <w:r>
+        <w:t>[</w:t>
+      </w:r>
+      <w:r>
+        <w:t>gnss_class_loc</w:t>
+      </w:r>
+      <w:r>
+        <w:t>]</w:t>
+      </w:r>
+      <w:r>
+        <w:t xml:space="preserve">. </w:t>
+      </w:r>
+      <w:r>
+        <w:t xml:space="preserve">Scopul </w:t>
+      </w:r>
+      <w:r>
+        <w:t>lucrării</w:t>
+      </w:r>
+      <w:r>
+        <w:t xml:space="preserve"> este de a clasifica interferentele transmise </w:t>
+      </w:r>
+      <w:r>
+        <w:t>intenționat</w:t>
+      </w:r>
+      <w:r>
+        <w:t xml:space="preserve"> in spectrul de frecvente GNSS</w:t>
+      </w:r>
+      <w:r>
+        <w:t xml:space="preserve">, cu </w:t>
+      </w:r>
+      <w:r>
+        <w:t>precădere</w:t>
+      </w:r>
+      <w:r>
+        <w:t xml:space="preserve"> banda L1/E1/B1, </w:t>
+      </w:r>
+      <w:r>
+        <w:t>situată</w:t>
+      </w:r>
+      <w:r>
+        <w:t xml:space="preserve"> la o </w:t>
+      </w:r>
+      <w:r>
+        <w:t>frecvența</w:t>
+      </w:r>
+      <w:r>
+        <w:t xml:space="preserve"> </w:t>
+      </w:r>
+      <w:r>
+        <w:t>centrală</w:t>
+      </w:r>
+      <w:r>
+        <w:t xml:space="preserve"> de 1575.42 MHz</w:t>
+      </w:r>
+      <w:r>
+        <w:t xml:space="preserve">, </w:t>
+      </w:r>
+      <w:r>
+        <w:t xml:space="preserve">folosind o </w:t>
+      </w:r>
+      <w:r>
+        <w:t>rețea</w:t>
+      </w:r>
+      <w:r>
+        <w:t xml:space="preserve"> neural</w:t>
+      </w:r>
+      <w:r>
+        <w:t>a,</w:t>
+      </w:r>
+      <w:r>
+        <w:t xml:space="preserve"> un tip de sistem cu </w:t>
+      </w:r>
+      <w:r>
+        <w:t>învățare</w:t>
+      </w:r>
+      <w:r>
+        <w:t xml:space="preserve"> </w:t>
+      </w:r>
+      <w:r>
+        <w:t>automată</w:t>
+      </w:r>
+      <w:r>
+        <w:t xml:space="preserve"> implementat pe</w:t>
+      </w:r>
+      <w:r>
+        <w:t xml:space="preserve"> un sistem integrat</w:t>
+      </w:r>
+      <w:r>
+        <w:t xml:space="preserve"> marca Nvidia Jetson pe post de demonstrator</w:t>
+      </w:r>
+      <w:r>
+        <w:t xml:space="preserve"> [].</w:t>
+      </w:r>
+    </w:p>
+    <w:p>
+      <w:pPr>
+        <w:widowControl w:val="0"/>
+        <w:tabs>
+          <w:tab w:val="left" w:pos="567"/>
+        </w:tabs>
+        <w:autoSpaceDE w:val="0"/>
+        <w:autoSpaceDN w:val="0"/>
+        <w:adjustRightInd w:val="0"/>
+        <w:rPr>
+          <w:b/>
+          <w:bCs/>
           <w:szCs w:val="24"/>
         </w:rPr>
       </w:pPr>
@@ -6014,7 +6448,7 @@
           <w:sz w:val="32"/>
           <w:szCs w:val="32"/>
         </w:rPr>
-        <w:t>Interferențe și provocări</w:t>
+        <w:t>Structura lucrării</w:t>
       </w:r>
     </w:p>
     <w:p>
@@ -6043,57 +6477,19 @@
         <w:tab/>
       </w:r>
       <w:r>
-        <w:t>In [4], autorii fac o prezentare sumara a provocarilor intalnite in procesarea semnalelor de navigatie. Lucrarea aceasta se concentreaza</w:t>
-      </w:r>
-      <w:r>
-        <w:t xml:space="preserve"> in special pe semnalele GNSS provenite din constelatiile GALILEO [5] si GPS [6]. Cu toate acestea, marea majoritate a semnalelor GNSS </w:t>
-      </w:r>
-      <w:r>
-        <w:lastRenderedPageBreak/>
-        <w:t>sunt transmise</w:t>
-      </w:r>
-      <w:r>
-        <w:t xml:space="preserve"> in banda de frecventa L, care inglobeaza frecventele situate intre 1-2 GHz [7]. Motivul pentru care aceasta banda a fost aleasa este pentru ca semnalele transmise la aceste frecvente exercita anumite proprietăți [1]. Cu toate acestea, semnalele GNSS sunt foarte susceptibile la efectele ionosferei, la deviatia ceasului receptorului si la fenomenul de reflexie al undelor (lb en.; </w:t>
-      </w:r>
-      <w:r>
-        <w:rPr>
-          <w:i/>
-          <w:iCs/>
-        </w:rPr>
-        <w:t>multipath</w:t>
-      </w:r>
-      <w:r>
-        <w:t xml:space="preserve">) sau de pierdere a traiectoriei directe de propagare (lb. en.; </w:t>
-      </w:r>
-      <w:r>
-        <w:rPr>
-          <w:i/>
-          <w:iCs/>
-        </w:rPr>
-        <w:t>line of sight loss</w:t>
-      </w:r>
-      <w:r>
-        <w:t xml:space="preserve">), acestea fiind printre cele mai des intalnite interferente naturale in semnalele GNSS. Totusi, scopul acestei lucrari este de a clasifica interferentele transmise intentionat in spectrul de frecvente de catre o terță parte, acestea fiind incadrate in doua mari categorii: semnalele de bruiaj (lb. en.; </w:t>
-      </w:r>
-      <w:r>
-        <w:rPr>
-          <w:i/>
-          <w:iCs/>
-        </w:rPr>
-        <w:t>jamming</w:t>
-      </w:r>
-      <w:r>
-        <w:t xml:space="preserve">) si semnalele de falsificare (lb. en.; </w:t>
-      </w:r>
-      <w:r>
-        <w:rPr>
-          <w:i/>
-          <w:iCs/>
-        </w:rPr>
-        <w:t>spoofing</w:t>
-      </w:r>
-      <w:r>
-        <w:t xml:space="preserve">). </w:t>
+        <w:t xml:space="preserve">Capitolul 1 a reprezentat introducerea </w:t>
+      </w:r>
+      <w:r>
+        <w:t>si motivația</w:t>
+      </w:r>
+      <w:r>
+        <w:t xml:space="preserve"> </w:t>
+      </w:r>
+      <w:r>
+        <w:t>lucrării</w:t>
+      </w:r>
+      <w:r>
+        <w:t>.</w:t>
       </w:r>
     </w:p>
     <w:p>
@@ -6109,13 +6505,82 @@
       </w:pPr>
       <w:r>
         <w:tab/>
-        <w:t xml:space="preserve">Bruiajul ia forma diverselor tehnici de transmisiune a zgomotului in banda spectrala de interes, blocand accesul receptoarelor la semnale GNSS utile. Falsificarea semnalelor pe de alta parte, consta in transmiterea unor semnale GNSS </w:t>
-      </w:r>
-      <w:r>
-        <w:t>false, fie semnale noi generate menite sa induca receptorul in eroare, fie semnale capturate si redate ulterior la putere mai mare, cu acelasi scop.</w:t>
-      </w:r>
-      <w:r>
-        <w:t xml:space="preserve"> Autorii in [4] mentioneaza faptul ca, in afara de tehnici clasice de combatere a interferentelor, pot fi utilizate si tehnici bazate pe retele neurale pentru a combate atat interferentele neintentionate, cat si cele intentionate (bruiajul si falsificarea).</w:t>
+      </w:r>
+      <w:r>
+        <w:t xml:space="preserve">Capitolul 2 va detalia ce sunt </w:t>
+      </w:r>
+      <w:r>
+        <w:t xml:space="preserve">semnalele GNSS, cum se </w:t>
+      </w:r>
+      <w:r>
+        <w:t>realizează</w:t>
+      </w:r>
+      <w:r>
+        <w:t xml:space="preserve"> </w:t>
+      </w:r>
+      <w:r>
+        <w:t>interferențele</w:t>
+      </w:r>
+      <w:r>
+        <w:t xml:space="preserve"> in </w:t>
+      </w:r>
+      <w:r>
+        <w:lastRenderedPageBreak/>
+        <w:t xml:space="preserve">spectrul de interes, </w:t>
+      </w:r>
+      <w:r>
+        <w:t>ce sunt rețelele</w:t>
+      </w:r>
+      <w:r>
+        <w:t xml:space="preserve"> neurale, cu </w:t>
+      </w:r>
+      <w:r>
+        <w:t>precădere</w:t>
+      </w:r>
+      <w:r>
+        <w:t xml:space="preserve"> cele </w:t>
+      </w:r>
+      <w:r>
+        <w:t>convoluționale</w:t>
+      </w:r>
+      <w:r>
+        <w:t xml:space="preserve">, si cum sunt folosite in </w:t>
+      </w:r>
+      <w:r>
+        <w:t>navigație</w:t>
+      </w:r>
+      <w:r>
+        <w:t xml:space="preserve"> in sens larg, precum si in clasificarea de semnale radio.</w:t>
+      </w:r>
+      <w:r>
+        <w:t xml:space="preserve"> Tot in acest </w:t>
+      </w:r>
+      <w:r>
+        <w:t>capitol</w:t>
+      </w:r>
+      <w:r>
+        <w:t xml:space="preserve"> sunt acoperite si seturile de date folosite in cercetarea </w:t>
+      </w:r>
+      <w:r>
+        <w:t>clasificării</w:t>
+      </w:r>
+      <w:r>
+        <w:t xml:space="preserve"> interferentelor, precum si natura sistemelor integrate, cu </w:t>
+      </w:r>
+      <w:r>
+        <w:t>precădere</w:t>
+      </w:r>
+      <w:r>
+        <w:t xml:space="preserve"> dispozitivul </w:t>
+      </w:r>
+      <w:r>
+        <w:t xml:space="preserve">integrat </w:t>
+      </w:r>
+      <w:r>
+        <w:t xml:space="preserve">folosit in cadrul acestui proiect. </w:t>
+      </w:r>
+      <w:r>
+        <w:t>La final se face o prezentare sumara a sistemelor radio definite software in cercetarea receptoarelor GNSS definite software.</w:t>
       </w:r>
     </w:p>
     <w:p>
@@ -6127,12 +6592,83 @@
         <w:autoSpaceDE w:val="0"/>
         <w:autoSpaceDN w:val="0"/>
         <w:adjustRightInd w:val="0"/>
-        <w:rPr>
-          <w:b/>
-          <w:bCs/>
-          <w:szCs w:val="24"/>
-        </w:rPr>
-      </w:pPr>
+        <w:jc w:val="both"/>
+      </w:pPr>
+      <w:r>
+        <w:tab/>
+      </w:r>
+      <w:r>
+        <w:t xml:space="preserve">Capitolul 3 </w:t>
+      </w:r>
+      <w:r>
+        <w:t>detaliază</w:t>
+      </w:r>
+      <w:r>
+        <w:t xml:space="preserve"> arhitecturile </w:t>
+      </w:r>
+      <w:r>
+        <w:t xml:space="preserve">neurale </w:t>
+      </w:r>
+      <w:r>
+        <w:t>testate</w:t>
+      </w:r>
+      <w:r>
+        <w:t xml:space="preserve"> in realizarea </w:t>
+      </w:r>
+      <w:r>
+        <w:t>lucrării</w:t>
+      </w:r>
+      <w:r>
+        <w:t xml:space="preserve">, cat si </w:t>
+      </w:r>
+      <w:r>
+        <w:t xml:space="preserve">arhitectura </w:t>
+      </w:r>
+      <w:r>
+        <w:t xml:space="preserve">neurala </w:t>
+      </w:r>
+      <w:r>
+        <w:t>propusa ca alternativa, precum si seturile de date folosite.</w:t>
+      </w:r>
+      <w:r>
+        <w:t xml:space="preserve"> Capitolul se </w:t>
+      </w:r>
+      <w:r>
+        <w:t>încheie</w:t>
+      </w:r>
+      <w:r>
+        <w:t xml:space="preserve"> cu o descriere completa a </w:t>
+      </w:r>
+      <w:r>
+        <w:t>implementării</w:t>
+      </w:r>
+      <w:r>
+        <w:t xml:space="preserve">  </w:t>
+      </w:r>
+      <w:r>
+        <w:t>lanțului</w:t>
+      </w:r>
+      <w:r>
+        <w:t xml:space="preserve"> de </w:t>
+      </w:r>
+      <w:r>
+        <w:t>recepție</w:t>
+      </w:r>
+      <w:r>
+        <w:t xml:space="preserve"> GNSS si cum a fost integrata </w:t>
+      </w:r>
+      <w:r>
+        <w:t>rețeaua</w:t>
+      </w:r>
+      <w:r>
+        <w:t xml:space="preserve"> neurala pentru a </w:t>
+      </w:r>
+      <w:r>
+        <w:t xml:space="preserve">putea testa </w:t>
+      </w:r>
+      <w:r>
+        <w:t>implementarea.</w:t>
+      </w:r>
     </w:p>
     <w:p>
       <w:pPr>
@@ -6143,10 +6679,251 @@
         <w:autoSpaceDE w:val="0"/>
         <w:autoSpaceDN w:val="0"/>
         <w:adjustRightInd w:val="0"/>
-        <w:rPr>
-          <w:b/>
-          <w:bCs/>
-          <w:szCs w:val="24"/>
+        <w:jc w:val="both"/>
+      </w:pPr>
+      <w:r>
+        <w:tab/>
+      </w:r>
+      <w:r>
+        <w:t xml:space="preserve">Capitolul 4 descrie rezultatele </w:t>
+      </w:r>
+      <w:r>
+        <w:t>obținute</w:t>
+      </w:r>
+      <w:r>
+        <w:t xml:space="preserve">, </w:t>
+      </w:r>
+      <w:r>
+        <w:t>atât</w:t>
+      </w:r>
+      <w:r>
+        <w:t xml:space="preserve"> cele </w:t>
+      </w:r>
+      <w:r>
+        <w:t>obținute</w:t>
+      </w:r>
+      <w:r>
+        <w:t xml:space="preserve"> din antrenarea </w:t>
+      </w:r>
+      <w:r>
+        <w:t>rețelelor</w:t>
+      </w:r>
+      <w:r>
+        <w:t xml:space="preserve"> neurale descrise in capitolul precedent, cat si rezultatele </w:t>
+      </w:r>
+      <w:r>
+        <w:t>obținute</w:t>
+      </w:r>
+      <w:r>
+        <w:t xml:space="preserve"> in urma unui experiment de testare in teren, in </w:t>
+      </w:r>
+      <w:r>
+        <w:t>condiții</w:t>
+      </w:r>
+      <w:r>
+        <w:t xml:space="preserve"> reale de mediu.</w:t>
+      </w:r>
+    </w:p>
+    <w:p>
+      <w:r>
+        <w:br w:type="page"/>
+      </w:r>
+    </w:p>
+    <w:p>
+      <w:pPr>
+        <w:widowControl w:val="0"/>
+        <w:tabs>
+          <w:tab w:val="left" w:pos="567"/>
+        </w:tabs>
+        <w:autoSpaceDE w:val="0"/>
+        <w:autoSpaceDN w:val="0"/>
+        <w:adjustRightInd w:val="0"/>
+        <w:jc w:val="both"/>
+      </w:pPr>
+    </w:p>
+    <w:p>
+      <w:r>
+        <w:br w:type="page"/>
+      </w:r>
+    </w:p>
+    <w:p>
+      <w:pPr>
+        <w:widowControl w:val="0"/>
+        <w:tabs>
+          <w:tab w:val="left" w:pos="567"/>
+        </w:tabs>
+        <w:autoSpaceDE w:val="0"/>
+        <w:autoSpaceDN w:val="0"/>
+        <w:adjustRightInd w:val="0"/>
+        <w:jc w:val="both"/>
+      </w:pPr>
+    </w:p>
+    <w:p>
+      <w:pPr>
+        <w:rPr>
+          <w:b/>
+          <w:bCs/>
+          <w:szCs w:val="24"/>
+        </w:rPr>
+      </w:pPr>
+    </w:p>
+    <w:p>
+      <w:pPr>
+        <w:ind w:left="567" w:hanging="141"/>
+        <w:rPr>
+          <w:b/>
+          <w:bCs/>
+          <w:szCs w:val="24"/>
+        </w:rPr>
+      </w:pPr>
+    </w:p>
+    <w:p>
+      <w:pPr>
+        <w:ind w:left="567" w:hanging="141"/>
+        <w:rPr>
+          <w:b/>
+          <w:bCs/>
+          <w:szCs w:val="24"/>
+        </w:rPr>
+      </w:pPr>
+    </w:p>
+    <w:p>
+      <w:pPr>
+        <w:ind w:left="567" w:hanging="141"/>
+        <w:rPr>
+          <w:b/>
+          <w:bCs/>
+          <w:szCs w:val="24"/>
+        </w:rPr>
+      </w:pPr>
+    </w:p>
+    <w:p>
+      <w:pPr>
+        <w:ind w:left="567" w:hanging="141"/>
+        <w:rPr>
+          <w:b/>
+          <w:bCs/>
+          <w:szCs w:val="24"/>
+        </w:rPr>
+      </w:pPr>
+    </w:p>
+    <w:p>
+      <w:pPr>
+        <w:pStyle w:val="A-DB12-12"/>
+        <w:numPr>
+          <w:ilvl w:val="0"/>
+          <w:numId w:val="32"/>
+        </w:numPr>
+        <w:tabs>
+          <w:tab w:val="clear" w:pos="567"/>
+          <w:tab w:val="clear" w:pos="851"/>
+        </w:tabs>
+        <w:spacing w:line="276" w:lineRule="auto"/>
+        <w:jc w:val="center"/>
+        <w:rPr>
+          <w:b/>
+          <w:bCs/>
+          <w:sz w:val="36"/>
+          <w:szCs w:val="36"/>
+        </w:rPr>
+      </w:pPr>
+      <w:r>
+        <w:rPr>
+          <w:b/>
+          <w:bCs/>
+          <w:sz w:val="36"/>
+          <w:szCs w:val="36"/>
+        </w:rPr>
+        <w:t>PREZENTARE GE</w:t>
+      </w:r>
+      <w:r>
+        <w:rPr>
+          <w:b/>
+          <w:bCs/>
+          <w:sz w:val="36"/>
+          <w:szCs w:val="36"/>
+        </w:rPr>
+        <w:t>N</w:t>
+      </w:r>
+      <w:r>
+        <w:rPr>
+          <w:b/>
+          <w:bCs/>
+          <w:sz w:val="36"/>
+          <w:szCs w:val="36"/>
+        </w:rPr>
+        <w:t>ERALĂ A MEDIULU</w:t>
+      </w:r>
+      <w:r>
+        <w:rPr>
+          <w:b/>
+          <w:bCs/>
+          <w:sz w:val="36"/>
+          <w:szCs w:val="36"/>
+        </w:rPr>
+        <w:t>I</w:t>
+      </w:r>
+      <w:r>
+        <w:rPr>
+          <w:b/>
+          <w:bCs/>
+          <w:sz w:val="36"/>
+          <w:szCs w:val="36"/>
+        </w:rPr>
+        <w:t xml:space="preserve"> (</w:t>
+      </w:r>
+      <w:r>
+        <w:rPr>
+          <w:b/>
+          <w:bCs/>
+          <w:sz w:val="36"/>
+          <w:szCs w:val="36"/>
+        </w:rPr>
+        <w:t>titlu temporar)</w:t>
+      </w:r>
+    </w:p>
+    <w:p>
+      <w:pPr>
+        <w:pStyle w:val="A-DB12-12"/>
+        <w:tabs>
+          <w:tab w:val="clear" w:pos="567"/>
+          <w:tab w:val="clear" w:pos="851"/>
+        </w:tabs>
+        <w:spacing w:line="276" w:lineRule="auto"/>
+        <w:ind w:left="360"/>
+        <w:rPr>
+          <w:b/>
+          <w:bCs/>
+        </w:rPr>
+      </w:pPr>
+    </w:p>
+    <w:p>
+      <w:pPr>
+        <w:pStyle w:val="A-DB12-12"/>
+        <w:tabs>
+          <w:tab w:val="clear" w:pos="567"/>
+          <w:tab w:val="clear" w:pos="851"/>
+        </w:tabs>
+        <w:spacing w:line="276" w:lineRule="auto"/>
+        <w:ind w:left="360"/>
+        <w:rPr>
+          <w:b/>
+          <w:bCs/>
+        </w:rPr>
+      </w:pPr>
+    </w:p>
+    <w:p>
+      <w:pPr>
+        <w:pStyle w:val="A-DB12-12"/>
+        <w:tabs>
+          <w:tab w:val="clear" w:pos="567"/>
+          <w:tab w:val="clear" w:pos="851"/>
+        </w:tabs>
+        <w:spacing w:line="276" w:lineRule="auto"/>
+        <w:ind w:left="360"/>
+        <w:rPr>
+          <w:b/>
+          <w:bCs/>
         </w:rPr>
       </w:pPr>
     </w:p>
@@ -6178,7 +6955,7 @@
           <w:sz w:val="32"/>
           <w:szCs w:val="32"/>
         </w:rPr>
-        <w:t>Structura lucrării</w:t>
+        <w:t>Sistemul GNSS</w:t>
       </w:r>
     </w:p>
     <w:p>
@@ -6190,27 +6967,43 @@
         <w:autoSpaceDE w:val="0"/>
         <w:autoSpaceDN w:val="0"/>
         <w:adjustRightInd w:val="0"/>
-      </w:pPr>
-    </w:p>
-    <w:p>
-      <w:pPr>
+        <w:ind w:left="360"/>
+        <w:rPr>
+          <w:b/>
+          <w:bCs/>
+          <w:szCs w:val="24"/>
+        </w:rPr>
+      </w:pPr>
+    </w:p>
+    <w:p>
+      <w:pPr>
+        <w:pStyle w:val="ListParagraph"/>
         <w:widowControl w:val="0"/>
+        <w:numPr>
+          <w:ilvl w:val="2"/>
+          <w:numId w:val="32"/>
+        </w:numPr>
         <w:tabs>
           <w:tab w:val="left" w:pos="567"/>
         </w:tabs>
         <w:autoSpaceDE w:val="0"/>
         <w:autoSpaceDN w:val="0"/>
         <w:adjustRightInd w:val="0"/>
-        <w:jc w:val="both"/>
-      </w:pPr>
-      <w:r>
-        <w:tab/>
-      </w:r>
-      <w:r>
-        <w:t xml:space="preserve">Capitolul 1 a reprezentat introducerea in problema: ce este sistemul GNSS, cum functioneaza navigatia pe baza acestui sistem, precum si problemele cu care sistemul se confrunta. Mai mult decat atat, a fost introdus conceptul de utilizare al retelelor neurale in navigatia pe baza GNSS si cum </w:t>
-      </w:r>
-      <w:r>
-        <w:t>vor fi utilizate in cadrul lucrarii.</w:t>
+        <w:rPr>
+          <w:b/>
+          <w:bCs/>
+          <w:sz w:val="32"/>
+          <w:szCs w:val="32"/>
+        </w:rPr>
+      </w:pPr>
+      <w:r>
+        <w:rPr>
+          <w:b/>
+          <w:bCs/>
+          <w:sz w:val="32"/>
+          <w:szCs w:val="32"/>
+        </w:rPr>
+        <w:t>Prezentare generală</w:t>
       </w:r>
     </w:p>
     <w:p>
@@ -6222,20 +7015,10 @@
         <w:autoSpaceDE w:val="0"/>
         <w:autoSpaceDN w:val="0"/>
         <w:adjustRightInd w:val="0"/>
-        <w:jc w:val="both"/>
-      </w:pPr>
-      <w:r>
-        <w:tab/>
-      </w:r>
-      <w:r>
-        <w:t>Capitolul 2 va detalia ce sunt retelele neurale, cu precadere cele convolutionale, si cum sunt folosite in navigatie in sens larg, precum si in clasificarea de semnale radio.</w:t>
-      </w:r>
-      <w:r>
-        <w:t xml:space="preserve"> Tot in acest captol sunt acoperite si seturile de date folosite in cercetarea clasificarii interferentelor, precum si natura sistemelor integrate, cu precadere dispozitivul folosit in cadrul acestui proiect. </w:t>
-      </w:r>
-      <w:r>
-        <w:t>La final se face o prezentare sumara a sistemelor radio definite software in cercetarea receptoarelor GNSS definite software.</w:t>
-      </w:r>
+        <w:rPr>
+          <w:szCs w:val="24"/>
+        </w:rPr>
+      </w:pPr>
     </w:p>
     <w:p>
       <w:pPr>
@@ -6246,47 +7029,10 @@
         <w:autoSpaceDE w:val="0"/>
         <w:autoSpaceDN w:val="0"/>
         <w:adjustRightInd w:val="0"/>
-        <w:jc w:val="both"/>
-      </w:pPr>
-      <w:r>
-        <w:tab/>
-      </w:r>
-      <w:r>
-        <w:t xml:space="preserve">Capitolul 3 </w:t>
-      </w:r>
-      <w:r>
-        <w:t>detaliază</w:t>
-      </w:r>
-      <w:r>
-        <w:t xml:space="preserve"> arhitecturile </w:t>
-      </w:r>
-      <w:r>
-        <w:t xml:space="preserve">neurale </w:t>
-      </w:r>
-      <w:r>
-        <w:t>testate</w:t>
-      </w:r>
-      <w:r>
-        <w:t xml:space="preserve"> in realizarea lucrarii, cat si </w:t>
-      </w:r>
-      <w:r>
-        <w:t xml:space="preserve">arhitectura </w:t>
-      </w:r>
-      <w:r>
-        <w:t xml:space="preserve">neurala </w:t>
-      </w:r>
-      <w:r>
-        <w:t>propusa ca alternativa, precum si seturile de date folosite.</w:t>
-      </w:r>
-      <w:r>
-        <w:t xml:space="preserve"> Capitolul se incheie cu o descriere completa a implementarii  lantului de receptie GNSS si cum a fost integrata reteaua neurala pentru a </w:t>
-      </w:r>
-      <w:r>
-        <w:t xml:space="preserve">putea testa </w:t>
-      </w:r>
-      <w:r>
-        <w:t>implementarea.</w:t>
-      </w:r>
+        <w:rPr>
+          <w:szCs w:val="24"/>
+        </w:rPr>
+      </w:pPr>
     </w:p>
     <w:p>
       <w:pPr>
@@ -6297,215 +7043,8 @@
         <w:autoSpaceDE w:val="0"/>
         <w:autoSpaceDN w:val="0"/>
         <w:adjustRightInd w:val="0"/>
-        <w:jc w:val="both"/>
-      </w:pPr>
-      <w:r>
-        <w:tab/>
-      </w:r>
-      <w:r>
-        <w:t>Capitolul 4 descrie rezultatele obtinute, atat cele obtinute din antrenarea retelelor neurale descrise in capitolul precedent, cat si rezultatele obtinute in urma unui experiment de testare in teren, in conditii reale de mediu.</w:t>
-      </w:r>
-    </w:p>
-    <w:p>
-      <w:r>
-        <w:br w:type="page"/>
-      </w:r>
-    </w:p>
-    <w:p>
-      <w:pPr>
-        <w:widowControl w:val="0"/>
-        <w:tabs>
-          <w:tab w:val="left" w:pos="567"/>
-        </w:tabs>
-        <w:autoSpaceDE w:val="0"/>
-        <w:autoSpaceDN w:val="0"/>
-        <w:adjustRightInd w:val="0"/>
-        <w:jc w:val="both"/>
-      </w:pPr>
-    </w:p>
-    <w:p>
-      <w:r>
-        <w:br w:type="page"/>
-      </w:r>
-    </w:p>
-    <w:p>
-      <w:pPr>
-        <w:widowControl w:val="0"/>
-        <w:tabs>
-          <w:tab w:val="left" w:pos="567"/>
-        </w:tabs>
-        <w:autoSpaceDE w:val="0"/>
-        <w:autoSpaceDN w:val="0"/>
-        <w:adjustRightInd w:val="0"/>
-        <w:jc w:val="both"/>
-      </w:pPr>
-    </w:p>
-    <w:p>
-      <w:pPr>
-        <w:rPr>
-          <w:b/>
-          <w:bCs/>
-          <w:szCs w:val="24"/>
-        </w:rPr>
-      </w:pPr>
-    </w:p>
-    <w:p>
-      <w:pPr>
-        <w:ind w:left="567" w:hanging="141"/>
-        <w:rPr>
-          <w:b/>
-          <w:bCs/>
-          <w:szCs w:val="24"/>
-        </w:rPr>
-      </w:pPr>
-    </w:p>
-    <w:p>
-      <w:pPr>
-        <w:ind w:left="567" w:hanging="141"/>
-        <w:rPr>
-          <w:b/>
-          <w:bCs/>
-          <w:szCs w:val="24"/>
-        </w:rPr>
-      </w:pPr>
-    </w:p>
-    <w:p>
-      <w:pPr>
-        <w:ind w:left="567" w:hanging="141"/>
-        <w:rPr>
-          <w:b/>
-          <w:bCs/>
-          <w:szCs w:val="24"/>
-        </w:rPr>
-      </w:pPr>
-    </w:p>
-    <w:p>
-      <w:pPr>
-        <w:ind w:left="567" w:hanging="141"/>
-        <w:rPr>
-          <w:b/>
-          <w:bCs/>
-          <w:szCs w:val="24"/>
-        </w:rPr>
-      </w:pPr>
-    </w:p>
-    <w:p>
-      <w:pPr>
-        <w:pStyle w:val="A-DB12-12"/>
-        <w:numPr>
-          <w:ilvl w:val="0"/>
-          <w:numId w:val="32"/>
-        </w:numPr>
-        <w:tabs>
-          <w:tab w:val="clear" w:pos="567"/>
-          <w:tab w:val="clear" w:pos="851"/>
-        </w:tabs>
-        <w:spacing w:line="276" w:lineRule="auto"/>
-        <w:jc w:val="center"/>
-        <w:rPr>
-          <w:b/>
-          <w:bCs/>
-          <w:sz w:val="36"/>
-          <w:szCs w:val="36"/>
-        </w:rPr>
-      </w:pPr>
-      <w:r>
-        <w:rPr>
-          <w:b/>
-          <w:bCs/>
-          <w:sz w:val="36"/>
-          <w:szCs w:val="36"/>
-        </w:rPr>
-        <w:t>PREZENTARE GE</w:t>
-      </w:r>
-      <w:r>
-        <w:rPr>
-          <w:b/>
-          <w:bCs/>
-          <w:sz w:val="36"/>
-          <w:szCs w:val="36"/>
-        </w:rPr>
-        <w:t>N</w:t>
-      </w:r>
-      <w:r>
-        <w:rPr>
-          <w:b/>
-          <w:bCs/>
-          <w:sz w:val="36"/>
-          <w:szCs w:val="36"/>
-        </w:rPr>
-        <w:t>ERALĂ A MEDIULU</w:t>
-      </w:r>
-      <w:r>
-        <w:rPr>
-          <w:b/>
-          <w:bCs/>
-          <w:sz w:val="36"/>
-          <w:szCs w:val="36"/>
-        </w:rPr>
-        <w:t>I</w:t>
-      </w:r>
-      <w:r>
-        <w:rPr>
-          <w:b/>
-          <w:bCs/>
-          <w:sz w:val="36"/>
-          <w:szCs w:val="36"/>
-        </w:rPr>
-        <w:t xml:space="preserve"> (</w:t>
-      </w:r>
-      <w:r>
-        <w:rPr>
-          <w:b/>
-          <w:bCs/>
-          <w:sz w:val="36"/>
-          <w:szCs w:val="36"/>
-        </w:rPr>
-        <w:t>titlu temporar)</w:t>
-      </w:r>
-    </w:p>
-    <w:p>
-      <w:pPr>
-        <w:pStyle w:val="A-DB12-12"/>
-        <w:tabs>
-          <w:tab w:val="clear" w:pos="567"/>
-          <w:tab w:val="clear" w:pos="851"/>
-        </w:tabs>
-        <w:spacing w:line="276" w:lineRule="auto"/>
-        <w:ind w:left="360"/>
-        <w:rPr>
-          <w:b/>
-          <w:bCs/>
-        </w:rPr>
-      </w:pPr>
-    </w:p>
-    <w:p>
-      <w:pPr>
-        <w:pStyle w:val="A-DB12-12"/>
-        <w:tabs>
-          <w:tab w:val="clear" w:pos="567"/>
-          <w:tab w:val="clear" w:pos="851"/>
-        </w:tabs>
-        <w:spacing w:line="276" w:lineRule="auto"/>
-        <w:ind w:left="360"/>
-        <w:rPr>
-          <w:b/>
-          <w:bCs/>
-        </w:rPr>
-      </w:pPr>
-    </w:p>
-    <w:p>
-      <w:pPr>
-        <w:pStyle w:val="A-DB12-12"/>
-        <w:tabs>
-          <w:tab w:val="clear" w:pos="567"/>
-          <w:tab w:val="clear" w:pos="851"/>
-        </w:tabs>
-        <w:spacing w:line="276" w:lineRule="auto"/>
-        <w:ind w:left="360"/>
-        <w:rPr>
-          <w:b/>
-          <w:bCs/>
+        <w:rPr>
+          <w:szCs w:val="24"/>
         </w:rPr>
       </w:pPr>
     </w:p>
@@ -6837,7 +7376,14 @@
         <w:rPr>
           <w:szCs w:val="24"/>
         </w:rPr>
-        <w:t xml:space="preserve">La nivel de industrie, nu exista un set de date GNSS pentru antrenarea retelelor neurale, existand mai multe variante. Datorita faptului ca tehnicile de detectie ale bruiajelor difera de cele pentru semnale falsificate, in sensul in care bruiajul este mult mai usor de detectat fara a fi nevoie de procesarea datelor din semnalul GNSS, cele doua sunt tratate de obicei drept probleme separate, neexistand un set de date care sa inglobeze ambele tipuri de date. Printre seturile de date consultate se numara </w:t>
+        <w:t xml:space="preserve">La nivel de industrie, nu exista un set de date GNSS pentru antrenarea retelelor neurale, existand mai multe variante. Datorita faptului ca tehnicile de detectie ale bruiajelor difera de cele pentru semnale falsificate, in sensul in care bruiajul este mult mai usor de detectat fara a </w:t>
+      </w:r>
+      <w:r>
+        <w:rPr>
+          <w:szCs w:val="24"/>
+        </w:rPr>
+        <w:lastRenderedPageBreak/>
+        <w:t xml:space="preserve">fi nevoie de procesarea datelor din semnalul GNSS, cele doua sunt tratate de obicei drept probleme separate, neexistand un set de date care sa inglobeze ambele tipuri de date. Printre seturile de date consultate se numara </w:t>
       </w:r>
       <w:r>
         <w:rPr>
@@ -11817,27 +12363,34 @@
         <w:rPr>
           <w:szCs w:val="24"/>
         </w:rPr>
-        <w:t xml:space="preserve">[4] </w:t>
-      </w:r>
-      <w:r>
-        <w:rPr>
-          <w:szCs w:val="24"/>
-        </w:rPr>
-        <w:t xml:space="preserve">J. Zidan, E. I. Adegoke, E. Kampert, S. A. Birrell, C. R. Ford and M. D. Higgins, "GNSS Vulnerabilities and Existing Solutions: A Review of the Literature," in </w:t>
-      </w:r>
-      <w:r>
-        <w:rPr>
-          <w:i/>
-          <w:iCs/>
-          <w:szCs w:val="24"/>
-        </w:rPr>
-        <w:t>IEEE Access</w:t>
-      </w:r>
-      <w:r>
-        <w:rPr>
-          <w:szCs w:val="24"/>
-        </w:rPr>
-        <w:t>, vol. 9, pp. 153960-153976, 2021, doi: 10.1109/ACCESS.2020.2973759</w:t>
+        <w:t>[</w:t>
+      </w:r>
+      <w:r>
+        <w:rPr>
+          <w:szCs w:val="24"/>
+        </w:rPr>
+        <w:t>war</w:t>
+      </w:r>
+      <w:r>
+        <w:rPr>
+          <w:szCs w:val="24"/>
+        </w:rPr>
+        <w:t xml:space="preserve">] </w:t>
+      </w:r>
+      <w:hyperlink r:id="rId52" w:history="1">
+        <w:r>
+          <w:rPr>
+            <w:rStyle w:val="Hyperlink"/>
+            <w:szCs w:val="24"/>
+          </w:rPr>
+          <w:t>https://www.bbc.com/news/war-in-ukraine</w:t>
+        </w:r>
+      </w:hyperlink>
+      <w:r>
+        <w:rPr>
+          <w:szCs w:val="24"/>
+        </w:rPr>
+        <w:t>, accesat 27.04.2026</w:t>
       </w:r>
     </w:p>
     <w:p>
@@ -11857,9 +12410,182 @@
         <w:rPr>
           <w:szCs w:val="24"/>
         </w:rPr>
+        <w:t>[</w:t>
+      </w:r>
+      <w:r>
+        <w:rPr>
+          <w:szCs w:val="24"/>
+        </w:rPr>
+        <w:t>nn_basic</w:t>
+      </w:r>
+      <w:r>
+        <w:rPr>
+          <w:szCs w:val="24"/>
+        </w:rPr>
+        <w:t xml:space="preserve">] </w:t>
+      </w:r>
+      <w:hyperlink r:id="rId53" w:history="1">
+        <w:r>
+          <w:rPr>
+            <w:rStyle w:val="Hyperlink"/>
+            <w:szCs w:val="24"/>
+          </w:rPr>
+          <w:t>https://introml.mit.edu/notes/neural_networks.html</w:t>
+        </w:r>
+      </w:hyperlink>
+      <w:r>
+        <w:rPr>
+          <w:szCs w:val="24"/>
+        </w:rPr>
+        <w:t>, accesat 28.04.2026</w:t>
+      </w:r>
+    </w:p>
+    <w:p>
+      <w:pPr>
+        <w:widowControl w:val="0"/>
+        <w:tabs>
+          <w:tab w:val="left" w:pos="567"/>
+        </w:tabs>
+        <w:autoSpaceDE w:val="0"/>
+        <w:autoSpaceDN w:val="0"/>
+        <w:adjustRightInd w:val="0"/>
+        <w:rPr>
+          <w:szCs w:val="24"/>
+        </w:rPr>
+      </w:pPr>
+      <w:r>
+        <w:rPr>
+          <w:szCs w:val="24"/>
+        </w:rPr>
+        <w:t>[</w:t>
+      </w:r>
+      <w:r>
+        <w:rPr>
+          <w:szCs w:val="24"/>
+        </w:rPr>
+        <w:t>npu_basic</w:t>
+      </w:r>
+      <w:r>
+        <w:rPr>
+          <w:szCs w:val="24"/>
+        </w:rPr>
+        <w:t>]</w:t>
+      </w:r>
+      <w:r>
+        <w:rPr>
+          <w:szCs w:val="24"/>
+        </w:rPr>
+        <w:t xml:space="preserve"> </w:t>
+      </w:r>
+      <w:hyperlink r:id="rId54" w:history="1">
+        <w:r>
+          <w:rPr>
+            <w:rStyle w:val="Hyperlink"/>
+            <w:szCs w:val="24"/>
+          </w:rPr>
+          <w:t>https://www.ibm.com/think/topics/neural-processing-unit</w:t>
+        </w:r>
+      </w:hyperlink>
+      <w:r>
+        <w:rPr>
+          <w:szCs w:val="24"/>
+        </w:rPr>
+        <w:t>, accesat 04.05.2026</w:t>
+      </w:r>
+    </w:p>
+    <w:p>
+      <w:pPr>
+        <w:widowControl w:val="0"/>
+        <w:tabs>
+          <w:tab w:val="left" w:pos="567"/>
+        </w:tabs>
+        <w:autoSpaceDE w:val="0"/>
+        <w:autoSpaceDN w:val="0"/>
+        <w:adjustRightInd w:val="0"/>
+        <w:rPr>
+          <w:szCs w:val="24"/>
+        </w:rPr>
+      </w:pPr>
+      <w:r>
+        <w:t>[gnss_class_loc]</w:t>
+      </w:r>
+      <w:r>
+        <w:t xml:space="preserve"> </w:t>
+      </w:r>
+      <w:r>
+        <w:t xml:space="preserve">S. Bartl, P. Berglez and B. Hofmann-Wellenhof, "GNSS interference detection, classification and localization using Software-Defined Radio," </w:t>
+      </w:r>
+      <w:r>
+        <w:rPr>
+          <w:i/>
+          <w:iCs/>
+        </w:rPr>
+        <w:t>2017 European Navigation Conference (ENC)</w:t>
+      </w:r>
+      <w:r>
+        <w:t>, Lausanne, Switzerland, 2017, pp. 159-169, doi: 10.1109/EURONAV.2017.7954205.</w:t>
+      </w:r>
+    </w:p>
+    <w:p>
+      <w:pPr>
+        <w:widowControl w:val="0"/>
+        <w:tabs>
+          <w:tab w:val="left" w:pos="567"/>
+        </w:tabs>
+        <w:autoSpaceDE w:val="0"/>
+        <w:autoSpaceDN w:val="0"/>
+        <w:adjustRightInd w:val="0"/>
+        <w:rPr>
+          <w:szCs w:val="24"/>
+        </w:rPr>
+      </w:pPr>
+      <w:r>
+        <w:rPr>
+          <w:szCs w:val="24"/>
+        </w:rPr>
+        <w:t xml:space="preserve">[4] </w:t>
+      </w:r>
+      <w:r>
+        <w:rPr>
+          <w:szCs w:val="24"/>
+        </w:rPr>
+        <w:t xml:space="preserve">J. Zidan, E. I. Adegoke, E. Kampert, S. A. Birrell, C. R. Ford and M. D. Higgins, "GNSS Vulnerabilities and Existing Solutions: A Review of the Literature," in </w:t>
+      </w:r>
+      <w:r>
+        <w:rPr>
+          <w:i/>
+          <w:iCs/>
+          <w:szCs w:val="24"/>
+        </w:rPr>
+        <w:t>IEEE Access</w:t>
+      </w:r>
+      <w:r>
+        <w:rPr>
+          <w:szCs w:val="24"/>
+        </w:rPr>
+        <w:t>, vol. 9, pp. 153960-153976, 2021, doi: 10.1109/ACCESS.2020.2973759</w:t>
+      </w:r>
+    </w:p>
+    <w:p>
+      <w:pPr>
+        <w:widowControl w:val="0"/>
+        <w:tabs>
+          <w:tab w:val="left" w:pos="567"/>
+        </w:tabs>
+        <w:autoSpaceDE w:val="0"/>
+        <w:autoSpaceDN w:val="0"/>
+        <w:adjustRightInd w:val="0"/>
+        <w:rPr>
+          <w:szCs w:val="24"/>
+        </w:rPr>
+      </w:pPr>
+      <w:r>
+        <w:rPr>
+          <w:szCs w:val="24"/>
+        </w:rPr>
         <w:t xml:space="preserve">[5] </w:t>
       </w:r>
-      <w:hyperlink r:id="rId52" w:history="1">
+      <w:hyperlink r:id="rId55" w:history="1">
         <w:r>
           <w:rPr>
             <w:rStyle w:val="Hyperlink"/>
@@ -11894,7 +12620,7 @@
         </w:rPr>
         <w:t xml:space="preserve">[6] </w:t>
       </w:r>
-      <w:hyperlink r:id="rId53" w:history="1">
+      <w:hyperlink r:id="rId56" w:history="1">
         <w:r>
           <w:rPr>
             <w:rStyle w:val="Hyperlink"/>
@@ -11929,7 +12655,7 @@
         </w:rPr>
         <w:t xml:space="preserve">[7] </w:t>
       </w:r>
-      <w:hyperlink r:id="rId54" w:history="1">
+      <w:hyperlink r:id="rId57" w:history="1">
         <w:r>
           <w:rPr>
             <w:rStyle w:val="Hyperlink"/>
@@ -12206,7 +12932,7 @@
         </w:rPr>
         <w:t xml:space="preserve">, 4475. </w:t>
       </w:r>
-      <w:hyperlink r:id="rId55" w:history="1">
+      <w:hyperlink r:id="rId58" w:history="1">
         <w:r>
           <w:rPr>
             <w:rStyle w:val="Hyperlink"/>
@@ -12241,7 +12967,7 @@
         </w:rPr>
         <w:t xml:space="preserve"> </w:t>
       </w:r>
-      <w:hyperlink r:id="rId56" w:history="1">
+      <w:hyperlink r:id="rId59" w:history="1">
         <w:r>
           <w:rPr>
             <w:rStyle w:val="Hyperlink"/>
@@ -12282,7 +13008,7 @@
         </w:rPr>
         <w:t xml:space="preserve">[14] </w:t>
       </w:r>
-      <w:hyperlink r:id="rId57" w:history="1">
+      <w:hyperlink r:id="rId60" w:history="1">
         <w:r>
           <w:rPr>
             <w:rStyle w:val="Hyperlink"/>
@@ -12343,7 +13069,7 @@
         </w:rPr>
         <w:t xml:space="preserve">[16] </w:t>
       </w:r>
-      <w:hyperlink r:id="rId58" w:history="1">
+      <w:hyperlink r:id="rId61" w:history="1">
         <w:r>
           <w:rPr>
             <w:rStyle w:val="Hyperlink"/>
@@ -12416,9 +13142,10 @@
         <w:rPr>
           <w:szCs w:val="24"/>
         </w:rPr>
+        <w:lastRenderedPageBreak/>
         <w:t xml:space="preserve">[18] </w:t>
       </w:r>
-      <w:hyperlink r:id="rId59" w:history="1">
+      <w:hyperlink r:id="rId62" w:history="1">
         <w:r>
           <w:rPr>
             <w:rStyle w:val="Hyperlink"/>
@@ -12497,14 +13224,7 @@
         <w:rPr>
           <w:szCs w:val="24"/>
         </w:rPr>
-        <w:t xml:space="preserve">van der Merwe, J.R.; Contreras Franco, D.; Hansen, J.; Brieger, T.; Feigl, T.; Ott, F.; Jdidi, D.; Rügamer, A.; Felber, W. Low-Cost COTS GNSS Interference Monitoring, </w:t>
-      </w:r>
-      <w:r>
-        <w:rPr>
-          <w:szCs w:val="24"/>
-        </w:rPr>
-        <w:lastRenderedPageBreak/>
-        <w:t xml:space="preserve">Detection, and Classification System. </w:t>
+        <w:t xml:space="preserve">van der Merwe, J.R.; Contreras Franco, D.; Hansen, J.; Brieger, T.; Feigl, T.; Ott, F.; Jdidi, D.; Rügamer, A.; Felber, W. Low-Cost COTS GNSS Interference Monitoring, Detection, and Classification System. </w:t>
       </w:r>
       <w:r>
         <w:rPr>
@@ -12548,7 +13268,7 @@
         </w:rPr>
         <w:t xml:space="preserve">, 3452. </w:t>
       </w:r>
-      <w:hyperlink r:id="rId60" w:history="1">
+      <w:hyperlink r:id="rId63" w:history="1">
         <w:r>
           <w:rPr>
             <w:rStyle w:val="Hyperlink"/>
@@ -12617,7 +13337,7 @@
         </w:rPr>
         <w:t xml:space="preserve">[22] </w:t>
       </w:r>
-      <w:hyperlink r:id="rId61" w:history="1">
+      <w:hyperlink r:id="rId64" w:history="1">
         <w:r>
           <w:rPr>
             <w:rStyle w:val="Hyperlink"/>
@@ -12648,10 +13368,10 @@
       </w:pPr>
     </w:p>
     <w:sectPr>
-      <w:headerReference w:type="default" r:id="rId62"/>
-      <w:footerReference w:type="default" r:id="rId63"/>
-      <w:headerReference w:type="first" r:id="rId64"/>
-      <w:footerReference w:type="first" r:id="rId65"/>
+      <w:headerReference w:type="default" r:id="rId65"/>
+      <w:footerReference w:type="default" r:id="rId66"/>
+      <w:headerReference w:type="first" r:id="rId67"/>
+      <w:footerReference w:type="first" r:id="rId68"/>
       <w:pgSz w:w="11907" w:h="16840" w:code="9"/>
       <w:pgMar w:top="1418" w:right="1418" w:bottom="1418" w:left="1418" w:header="709" w:footer="709" w:gutter="0"/>
       <w:cols w:space="720"/>
@@ -17704,7 +18424,6 @@
   <w:style w:type="character" w:default="1" w:styleId="DefaultParagraphFont">
     <w:name w:val="Default Paragraph Font"/>
     <w:uiPriority w:val="1"/>
-    <w:semiHidden/>
     <w:unhideWhenUsed/>
   </w:style>
   <w:style w:type="table" w:default="1" w:styleId="TableNormal">

</xml_diff>